<commit_message>
docs: final update — remove Vercel references, frontend deploys via cPanel API
Co-Authored-By: Claude Opus 4.6 (1M context) <noreply@anthropic.com>
</commit_message>
<xml_diff>
--- a/Chronos.docx
+++ b/Chronos.docx
@@ -378,6 +378,18 @@
       </w:r>
     </w:p>
     <w:p>
+      <w:pPr/>
+      <w:r>
+        <w:t>23. Security Hardening</w:t>
+      </w:r>
+    </w:p>
+    <w:p>
+      <w:pPr/>
+      <w:r>
+        <w:t>24. Legal Compliance</w:t>
+      </w:r>
+    </w:p>
+    <w:p>
       <w:r>
         <w:br w:type="page"/>
       </w:r>
@@ -859,19 +871,7 @@
         <w:pStyle w:val="ListBullet"/>
       </w:pPr>
       <w:r>
-        <w:rPr>
-          <w:rFonts w:ascii="Calibri" w:hAnsi="Calibri"/>
-          <w:b/>
-          <w:sz w:val="21"/>
-        </w:rPr>
-        <w:t>Scalability:</w:t>
-      </w:r>
-      <w:r>
-        <w:rPr>
-          <w:rFonts w:ascii="Calibri" w:hAnsi="Calibri"/>
-          <w:sz w:val="21"/>
-        </w:rPr>
-        <w:t xml:space="preserve"> Frontend on Vercel CDN, backend on cPanel — each optimized independently</w:t>
+        <w:t>Scalability: Frontend on cPanel CDN, backend on cPanel — each optimized independently</w:t>
       </w:r>
     </w:p>
     <w:p>
@@ -10686,11 +10686,7 @@
         <w:pStyle w:val="ListBullet"/>
       </w:pPr>
       <w:r>
-        <w:rPr>
-          <w:rFonts w:ascii="Calibri" w:hAnsi="Calibri"/>
-          <w:sz w:val="21"/>
-        </w:rPr>
-        <w:t>On success: Vercel auto-deploys frontend via Git integration (zero config)</w:t>
+        <w:t>On success: CI builds frontend with VITE_API_URL and deploys dist/ to cPanel via Fileman API</w:t>
       </w:r>
     </w:p>
     <w:p>

</xml_diff>